<commit_message>
Update project documentation, ER diagram, and alert components
</commit_message>
<xml_diff>
--- a/Sem 4 Docs/Project Scope sem 4.docx
+++ b/Sem 4 Docs/Project Scope sem 4.docx
@@ -1745,15 +1745,7 @@
         <w:rPr>
           <w:rStyle w:val="citation-64"/>
         </w:rPr>
-        <w:t xml:space="preserve"> from various network sensors and endpoint agents, ensuring data integrity before proc</w:t>
-      </w:r>
-      <w:bookmarkStart w:id="0" w:name="_GoBack"/>
-      <w:bookmarkEnd w:id="0"/>
-      <w:r>
-        <w:rPr>
-          <w:rStyle w:val="citation-64"/>
-        </w:rPr>
-        <w:t xml:space="preserve">essing. </w:t>
+        <w:t xml:space="preserve"> from various network sensors and endpoint agents, ensuring data integrity before processing. </w:t>
       </w:r>
     </w:p>
     <w:p>
@@ -2292,17 +2284,15 @@
       </w:pPr>
       <w:r>
         <w:rPr>
-          <w:noProof/>
           <w:sz w:val="32"/>
           <w:szCs w:val="32"/>
-          <w14:ligatures w14:val="standardContextual"/>
         </w:rPr>
         <w:lastRenderedPageBreak/>
         <w:drawing>
-          <wp:inline distT="0" distB="0" distL="0" distR="0">
-            <wp:extent cx="6286500" cy="3596640"/>
-            <wp:effectExtent l="0" t="0" r="0" b="3810"/>
-            <wp:docPr id="4" name="Picture 4"/>
+          <wp:inline distT="0" distB="0" distL="0" distR="0" wp14:anchorId="3CAB1118" wp14:editId="434A28DC">
+            <wp:extent cx="5731510" cy="3549015"/>
+            <wp:effectExtent l="0" t="0" r="2540" b="0"/>
+            <wp:docPr id="1" name="Picture 1"/>
             <wp:cNvGraphicFramePr>
               <a:graphicFrameLocks xmlns:a="http://schemas.openxmlformats.org/drawingml/2006/main" noChangeAspect="1"/>
             </wp:cNvGraphicFramePr>
@@ -2310,17 +2300,11 @@
               <a:graphicData uri="http://schemas.openxmlformats.org/drawingml/2006/picture">
                 <pic:pic xmlns:pic="http://schemas.openxmlformats.org/drawingml/2006/picture">
                   <pic:nvPicPr>
-                    <pic:cNvPr id="4" name="ER Diagram.png"/>
+                    <pic:cNvPr id="1" name=""/>
                     <pic:cNvPicPr/>
                   </pic:nvPicPr>
                   <pic:blipFill>
-                    <a:blip r:embed="rId5">
-                      <a:extLst>
-                        <a:ext uri="{28A0092B-C50C-407E-A947-70E740481C1C}">
-                          <a14:useLocalDpi xmlns:a14="http://schemas.microsoft.com/office/drawing/2010/main" val="0"/>
-                        </a:ext>
-                      </a:extLst>
-                    </a:blip>
+                    <a:blip r:embed="rId5"/>
                     <a:stretch>
                       <a:fillRect/>
                     </a:stretch>
@@ -2328,7 +2312,7 @@
                   <pic:spPr>
                     <a:xfrm>
                       <a:off x="0" y="0"/>
-                      <a:ext cx="6286500" cy="3596640"/>
+                      <a:ext cx="5731510" cy="3549015"/>
                     </a:xfrm>
                     <a:prstGeom prst="rect">
                       <a:avLst/>
@@ -2340,6 +2324,8 @@
           </wp:inline>
         </w:drawing>
       </w:r>
+      <w:bookmarkStart w:id="0" w:name="_GoBack"/>
+      <w:bookmarkEnd w:id="0"/>
     </w:p>
     <w:p>
       <w:pPr>
@@ -6727,6 +6713,34 @@
     <w:basedOn w:val="DefaultParagraphFont"/>
     <w:rsid w:val="00432914"/>
   </w:style>
+  <w:style w:type="paragraph" w:styleId="PlainText">
+    <w:name w:val="Plain Text"/>
+    <w:basedOn w:val="Normal"/>
+    <w:link w:val="PlainTextChar"/>
+    <w:uiPriority w:val="99"/>
+    <w:unhideWhenUsed/>
+    <w:rsid w:val="000F5B6D"/>
+    <w:pPr>
+      <w:spacing w:after="0" w:line="240" w:lineRule="auto"/>
+    </w:pPr>
+    <w:rPr>
+      <w:rFonts w:ascii="Consolas" w:hAnsi="Consolas"/>
+      <w:sz w:val="21"/>
+      <w:szCs w:val="21"/>
+    </w:rPr>
+  </w:style>
+  <w:style w:type="character" w:customStyle="1" w:styleId="PlainTextChar">
+    <w:name w:val="Plain Text Char"/>
+    <w:basedOn w:val="DefaultParagraphFont"/>
+    <w:link w:val="PlainText"/>
+    <w:uiPriority w:val="99"/>
+    <w:rsid w:val="000F5B6D"/>
+    <w:rPr>
+      <w:rFonts w:ascii="Consolas" w:hAnsi="Consolas"/>
+      <w:sz w:val="21"/>
+      <w:szCs w:val="21"/>
+    </w:rPr>
+  </w:style>
 </w:styles>
 </file>
 

</xml_diff>